<commit_message>
Redesign diocesan documents as landscape visual reports
</commit_message>
<xml_diff>
--- a/docs/diocese-catalog/Prihod_brief.docx
+++ b/docs/diocese-catalog/Prihod_brief.docx
@@ -7,17 +7,12 @@
         <w:pStyle w:val="Title"/>
       </w:pPr>
       <w:r>
-        <w:t>Проект Приход для приходов епархии</w:t>
+        <w:t>Приход может вести сайт самостоятельно</w:t>
       </w:r>
     </w:p>
     <w:p>
       <w:r>
-        <w:t>Его Высокопреосвященству архиепископу Рузскому Тихону, управляющему Берлинско-Германской епархией</w:t>
-      </w:r>
-    </w:p>
-    <w:p>
-      <w:r>
-        <w:t>Ваше Высокопреосвященство! Просим рассмотреть проект «Приход» и благословить добровольное опытное применение в нескольких приходах. Он даёт сотруднику готовые средства, чтобы самостоятельно подготовить сайт, вести расписание и поддерживать связь с людьми. Мы готовы помочь с техническим запуском и обучением.</w:t>
+        <w:t>Ваше Высокопреосвященство, Владыка Тихон! Предлагаем проект «Приход» и просим рассмотреть добровольное опытное применение в нескольких приходах. Мы даём готовые средства и готовы помочь с техническим запуском и обучением.</w:t>
       </w:r>
     </w:p>
     <w:p>
@@ -27,7 +22,7 @@
       <w:r>
         <w:drawing>
           <wp:inline xmlns:a="http://schemas.openxmlformats.org/drawingml/2006/main" xmlns:pic="http://schemas.openxmlformats.org/drawingml/2006/picture">
-            <wp:extent cx="4533515" cy="2834640"/>
+            <wp:extent cx="6727151" cy="4206240"/>
             <wp:docPr id="1" name="Picture 1"/>
             <wp:cNvGraphicFramePr>
               <a:graphicFrameLocks noChangeAspect="1"/>
@@ -48,7 +43,7 @@
                   <pic:spPr>
                     <a:xfrm>
                       <a:off x="0" y="0"/>
-                      <a:ext cx="4533515" cy="2834640"/>
+                      <a:ext cx="6727151" cy="4206240"/>
                     </a:xfrm>
                     <a:prstGeom prst="rect"/>
                   </pic:spPr>
@@ -64,17 +59,7 @@
         <w:pStyle w:val="Caption"/>
       </w:pPr>
       <w:r>
-        <w:t>Пример работающего демонстрационного сайта на материалах Свято Георгиевского монастыря.</w:t>
-      </w:r>
-    </w:p>
-    <w:p>
-      <w:r>
-        <w:t>Сотрудник проходит мастер, заполняет сведения о приходе, выбирает оформление, проверяет страницы и публикует их после подтверждения. Для повседневных задач предусмотрены готовые формы: добавить службу, изменить её время, оформить отмену, обновить контакты, принять вопрос и ответить. Обычные действия не требуют редактирования кода.</w:t>
-      </w:r>
-    </w:p>
-    <w:p>
-      <w:r>
-        <w:t>Исследование официального списка выявило 102 карточки храмов и общин. В 26 карточках нет ссылки на сайт; 70 указанных адресов проверены, пять дали повторную сетевую ошибку или запрос авторизации. В выбранных примерах подтверждены трудности чтения расписания и навигации с телефона. При этом в епархии есть удачные сайты, решения которых стоит сохранять.</w:t>
+        <w:t>Сотрудник проходит мастер, выбирает оформление и работает с готовыми формами. Обычное обновление расписания, контактов и материалов не требует редактирования программного кода.</w:t>
       </w:r>
     </w:p>
     <w:p>
@@ -92,367 +77,74 @@
     </w:p>
     <w:p>
       <w:r>
-        <w:t>Предлагаем пилот в трёх заинтересованных приходах разного размера. После установки и первого наполнения сотрудник самостоятельно выполняет типовые задачи. В течение предлагаемых четырёх недель фиксируются трудности, время работы и случаи необходимой помощи. Участники, сроки, стоимость и объём поддержки согласуются до начала.</w:t>
+        <w:t>Предлагаем пилот в трёх приходах с четырьмя неделями наблюдения после запуска. Участники, сроки, стоимость и объём помощи согласуются до начала.</w:t>
       </w:r>
     </w:p>
-    <w:tbl>
-      <w:tblPr>
-        <w:tblW w:type="auto" w:w="0"/>
-        <w:tblLayout w:type="fixed"/>
-        <w:tblLook w:firstColumn="1" w:firstRow="1" w:lastColumn="0" w:lastRow="0" w:noHBand="0" w:noVBand="1" w:val="04A0"/>
-      </w:tblPr>
-      <w:tblGrid>
-        <w:gridCol w:w="5040"/>
-        <w:gridCol w:w="5040"/>
-      </w:tblGrid>
-      <w:tr>
-        <w:trPr>
-          <w:tblHeader/>
-        </w:trPr>
-        <w:tc>
-          <w:tcPr>
-            <w:tcW w:type="dxa" w:w="4896"/>
-            <w:tcBorders>
-              <w:top w:val="single" w:sz="4" w:color="D9D9D9"/>
-              <w:left w:val="single" w:sz="4" w:color="D9D9D9"/>
-              <w:bottom w:val="single" w:sz="4" w:color="D9D9D9"/>
-              <w:right w:val="single" w:sz="4" w:color="D9D9D9"/>
-            </w:tcBorders>
-            <w:shd w:fill="20374A"/>
-            <w:tcMar>
-              <w:top w:w="85" w:type="dxa"/>
-              <w:left w:w="85" w:type="dxa"/>
-              <w:bottom w:w="85" w:type="dxa"/>
-              <w:right w:w="85" w:type="dxa"/>
-            </w:tcMar>
-          </w:tcPr>
-          <w:p>
-            <w:pPr>
-              <w:spacing w:after="60" w:line="245" w:lineRule="auto"/>
-            </w:pPr>
-            <w:r>
-              <w:rPr>
-                <w:b/>
-                <w:color w:val="FFFFFF"/>
-                <w:sz w:val="18"/>
-              </w:rPr>
-              <w:t>Для прихода</w:t>
-            </w:r>
-          </w:p>
-        </w:tc>
-        <w:tc>
-          <w:tcPr>
-            <w:tcW w:type="dxa" w:w="4896"/>
-            <w:tcBorders>
-              <w:top w:val="single" w:sz="4" w:color="D9D9D9"/>
-              <w:left w:val="single" w:sz="4" w:color="D9D9D9"/>
-              <w:bottom w:val="single" w:sz="4" w:color="D9D9D9"/>
-              <w:right w:val="single" w:sz="4" w:color="D9D9D9"/>
-            </w:tcBorders>
-            <w:shd w:fill="20374A"/>
-            <w:tcMar>
-              <w:top w:w="85" w:type="dxa"/>
-              <w:left w:w="85" w:type="dxa"/>
-              <w:bottom w:w="85" w:type="dxa"/>
-              <w:right w:w="85" w:type="dxa"/>
-            </w:tcMar>
-          </w:tcPr>
-          <w:p>
-            <w:pPr>
-              <w:spacing w:after="60" w:line="245" w:lineRule="auto"/>
-            </w:pPr>
-            <w:r>
-              <w:rPr>
-                <w:b/>
-                <w:color w:val="FFFFFF"/>
-                <w:sz w:val="18"/>
-              </w:rPr>
-              <w:t>Для посетителя</w:t>
-            </w:r>
-          </w:p>
-        </w:tc>
-      </w:tr>
-      <w:tr>
-        <w:trPr/>
-        <w:tc>
-          <w:tcPr>
-            <w:tcW w:type="dxa" w:w="4896"/>
-            <w:tcBorders>
-              <w:top w:val="single" w:sz="4" w:color="D9D9D9"/>
-              <w:left w:val="single" w:sz="4" w:color="D9D9D9"/>
-              <w:bottom w:val="single" w:sz="4" w:color="D9D9D9"/>
-              <w:right w:val="single" w:sz="4" w:color="D9D9D9"/>
-            </w:tcBorders>
-            <w:shd w:fill="FFFFFF"/>
-            <w:tcMar>
-              <w:top w:w="85" w:type="dxa"/>
-              <w:left w:w="85" w:type="dxa"/>
-              <w:bottom w:w="85" w:type="dxa"/>
-              <w:right w:w="85" w:type="dxa"/>
-            </w:tcMar>
-          </w:tcPr>
-          <w:p>
-            <w:pPr>
-              <w:spacing w:after="60" w:line="245" w:lineRule="auto"/>
-            </w:pPr>
-            <w:r>
-              <w:rPr>
-                <w:b w:val="0"/>
-                <w:color w:val="000000"/>
-                <w:sz w:val="18"/>
-              </w:rPr>
-              <w:t>Готовые страницы и пять вариантов оформления.</w:t>
-            </w:r>
-          </w:p>
-        </w:tc>
-        <w:tc>
-          <w:tcPr>
-            <w:tcW w:type="dxa" w:w="4896"/>
-            <w:tcBorders>
-              <w:top w:val="single" w:sz="4" w:color="D9D9D9"/>
-              <w:left w:val="single" w:sz="4" w:color="D9D9D9"/>
-              <w:bottom w:val="single" w:sz="4" w:color="D9D9D9"/>
-              <w:right w:val="single" w:sz="4" w:color="D9D9D9"/>
-            </w:tcBorders>
-            <w:shd w:fill="FFFFFF"/>
-            <w:tcMar>
-              <w:top w:w="85" w:type="dxa"/>
-              <w:left w:w="85" w:type="dxa"/>
-              <w:bottom w:w="85" w:type="dxa"/>
-              <w:right w:w="85" w:type="dxa"/>
-            </w:tcMar>
-          </w:tcPr>
-          <w:p>
-            <w:pPr>
-              <w:spacing w:after="60" w:line="245" w:lineRule="auto"/>
-            </w:pPr>
-            <w:r>
-              <w:rPr>
-                <w:b w:val="0"/>
-                <w:color w:val="000000"/>
-                <w:sz w:val="18"/>
-              </w:rPr>
-              <w:t>Понятный путь к расписанию, адресу и контакту.</w:t>
-            </w:r>
-          </w:p>
-        </w:tc>
-      </w:tr>
-      <w:tr>
-        <w:trPr/>
-        <w:tc>
-          <w:tcPr>
-            <w:tcW w:type="dxa" w:w="4896"/>
-            <w:tcBorders>
-              <w:top w:val="single" w:sz="4" w:color="D9D9D9"/>
-              <w:left w:val="single" w:sz="4" w:color="D9D9D9"/>
-              <w:bottom w:val="single" w:sz="4" w:color="D9D9D9"/>
-              <w:right w:val="single" w:sz="4" w:color="D9D9D9"/>
-            </w:tcBorders>
-            <w:shd w:fill="F2F5F7"/>
-            <w:tcMar>
-              <w:top w:w="85" w:type="dxa"/>
-              <w:left w:w="85" w:type="dxa"/>
-              <w:bottom w:w="85" w:type="dxa"/>
-              <w:right w:w="85" w:type="dxa"/>
-            </w:tcMar>
-          </w:tcPr>
-          <w:p>
-            <w:pPr>
-              <w:spacing w:after="60" w:line="245" w:lineRule="auto"/>
-            </w:pPr>
-            <w:r>
-              <w:rPr>
-                <w:b w:val="0"/>
-                <w:color w:val="000000"/>
-                <w:sz w:val="18"/>
-              </w:rPr>
-              <w:t>Единое ведение служб, переносов и отмен.</w:t>
-            </w:r>
-          </w:p>
-        </w:tc>
-        <w:tc>
-          <w:tcPr>
-            <w:tcW w:type="dxa" w:w="4896"/>
-            <w:tcBorders>
-              <w:top w:val="single" w:sz="4" w:color="D9D9D9"/>
-              <w:left w:val="single" w:sz="4" w:color="D9D9D9"/>
-              <w:bottom w:val="single" w:sz="4" w:color="D9D9D9"/>
-              <w:right w:val="single" w:sz="4" w:color="D9D9D9"/>
-            </w:tcBorders>
-            <w:shd w:fill="F2F5F7"/>
-            <w:tcMar>
-              <w:top w:w="85" w:type="dxa"/>
-              <w:left w:w="85" w:type="dxa"/>
-              <w:bottom w:w="85" w:type="dxa"/>
-              <w:right w:w="85" w:type="dxa"/>
-            </w:tcMar>
-          </w:tcPr>
-          <w:p>
-            <w:pPr>
-              <w:spacing w:after="60" w:line="245" w:lineRule="auto"/>
-            </w:pPr>
-            <w:r>
-              <w:rPr>
-                <w:b w:val="0"/>
-                <w:color w:val="000000"/>
-                <w:sz w:val="18"/>
-              </w:rPr>
-              <w:t>Ближайшая служба и подробное расписание.</w:t>
-            </w:r>
-          </w:p>
-        </w:tc>
-      </w:tr>
-      <w:tr>
-        <w:trPr/>
-        <w:tc>
-          <w:tcPr>
-            <w:tcW w:type="dxa" w:w="4896"/>
-            <w:tcBorders>
-              <w:top w:val="single" w:sz="4" w:color="D9D9D9"/>
-              <w:left w:val="single" w:sz="4" w:color="D9D9D9"/>
-              <w:bottom w:val="single" w:sz="4" w:color="D9D9D9"/>
-              <w:right w:val="single" w:sz="4" w:color="D9D9D9"/>
-            </w:tcBorders>
-            <w:shd w:fill="FFFFFF"/>
-            <w:tcMar>
-              <w:top w:w="85" w:type="dxa"/>
-              <w:left w:w="85" w:type="dxa"/>
-              <w:bottom w:w="85" w:type="dxa"/>
-              <w:right w:w="85" w:type="dxa"/>
-            </w:tcMar>
-          </w:tcPr>
-          <w:p>
-            <w:pPr>
-              <w:spacing w:after="60" w:line="245" w:lineRule="auto"/>
-            </w:pPr>
-            <w:r>
-              <w:rPr>
-                <w:b w:val="0"/>
-                <w:color w:val="000000"/>
-                <w:sz w:val="18"/>
-              </w:rPr>
-              <w:t>Закрытый кабинет обращений и права сотрудников.</w:t>
-            </w:r>
-          </w:p>
-        </w:tc>
-        <w:tc>
-          <w:tcPr>
-            <w:tcW w:type="dxa" w:w="4896"/>
-            <w:tcBorders>
-              <w:top w:val="single" w:sz="4" w:color="D9D9D9"/>
-              <w:left w:val="single" w:sz="4" w:color="D9D9D9"/>
-              <w:bottom w:val="single" w:sz="4" w:color="D9D9D9"/>
-              <w:right w:val="single" w:sz="4" w:color="D9D9D9"/>
-            </w:tcBorders>
-            <w:shd w:fill="FFFFFF"/>
-            <w:tcMar>
-              <w:top w:w="85" w:type="dxa"/>
-              <w:left w:w="85" w:type="dxa"/>
-              <w:bottom w:w="85" w:type="dxa"/>
-              <w:right w:w="85" w:type="dxa"/>
-            </w:tcMar>
-          </w:tcPr>
-          <w:p>
-            <w:pPr>
-              <w:spacing w:after="60" w:line="245" w:lineRule="auto"/>
-            </w:pPr>
-            <w:r>
-              <w:rPr>
-                <w:b w:val="0"/>
-                <w:color w:val="000000"/>
-                <w:sz w:val="18"/>
-              </w:rPr>
-              <w:t>Вопрос священнику без обязательной регистрации.</w:t>
-            </w:r>
-          </w:p>
-        </w:tc>
-      </w:tr>
-      <w:tr>
-        <w:trPr/>
-        <w:tc>
-          <w:tcPr>
-            <w:tcW w:type="dxa" w:w="4896"/>
-            <w:tcBorders>
-              <w:top w:val="single" w:sz="4" w:color="D9D9D9"/>
-              <w:left w:val="single" w:sz="4" w:color="D9D9D9"/>
-              <w:bottom w:val="single" w:sz="4" w:color="D9D9D9"/>
-              <w:right w:val="single" w:sz="4" w:color="D9D9D9"/>
-            </w:tcBorders>
-            <w:shd w:fill="F2F5F7"/>
-            <w:tcMar>
-              <w:top w:w="85" w:type="dxa"/>
-              <w:left w:w="85" w:type="dxa"/>
-              <w:bottom w:w="85" w:type="dxa"/>
-              <w:right w:w="85" w:type="dxa"/>
-            </w:tcMar>
-          </w:tcPr>
-          <w:p>
-            <w:pPr>
-              <w:spacing w:after="60" w:line="245" w:lineRule="auto"/>
-            </w:pPr>
-            <w:r>
-              <w:rPr>
-                <w:b w:val="0"/>
-                <w:color w:val="000000"/>
-                <w:sz w:val="18"/>
-              </w:rPr>
-              <w:t>Помощь при запуске и освоении по согласованию.</w:t>
-            </w:r>
-          </w:p>
-        </w:tc>
-        <w:tc>
-          <w:tcPr>
-            <w:tcW w:type="dxa" w:w="4896"/>
-            <w:tcBorders>
-              <w:top w:val="single" w:sz="4" w:color="D9D9D9"/>
-              <w:left w:val="single" w:sz="4" w:color="D9D9D9"/>
-              <w:bottom w:val="single" w:sz="4" w:color="D9D9D9"/>
-              <w:right w:val="single" w:sz="4" w:color="D9D9D9"/>
-            </w:tcBorders>
-            <w:shd w:fill="F2F5F7"/>
-            <w:tcMar>
-              <w:top w:w="85" w:type="dxa"/>
-              <w:left w:w="85" w:type="dxa"/>
-              <w:bottom w:w="85" w:type="dxa"/>
-              <w:right w:w="85" w:type="dxa"/>
-            </w:tcMar>
-          </w:tcPr>
-          <w:p>
-            <w:pPr>
-              <w:spacing w:after="60" w:line="245" w:lineRule="auto"/>
-            </w:pPr>
-            <w:r>
-              <w:rPr>
-                <w:b w:val="0"/>
-                <w:color w:val="000000"/>
-                <w:sz w:val="18"/>
-              </w:rPr>
-              <w:t>Подготовленное мобильное оформление.</w:t>
-            </w:r>
-          </w:p>
-        </w:tc>
-      </w:tr>
-    </w:tbl>
     <w:p>
+      <w:pPr>
+        <w:pStyle w:val="Heading2"/>
+      </w:pPr>
       <w:r>
-        <w:t>Основной продукт уже реализован в WordPress и имеет статус release candidate. Календарь, записки, пожертвования и внешние сервисы подключаются отдельно и требуют настройки. Интерфейс переведён на четыре языка; содержание прихода не переводится автоматически. Единой епархиальной панели и подтверждённой статистики посещаемости в продукте не заявляется.</w:t>
+        <w:t>Основание</w:t>
       </w:r>
     </w:p>
     <w:p>
       <w:r>
-        <w:t>Просим Вашего благословения на демонстрацию заинтересованным настоятелям и согласование пилота через назначенное контактное лицо. Цель — проверить, насколько самостоятельно приход может вести полезный сайт, и определить реальную потребность в помощи.</w:t>
+        <w:t>Проверены 102 карточки, 70 опубликованных адресов и 65 мобильных страниц. В пяти случаях повторилась ошибка открытия, ещё один адрес сообщает об удалении сайта. В 20 мобильных просмотрах ширина документа превышает экран. Подробности — в иллюстрированном обзоре.</w:t>
+      </w:r>
+    </w:p>
+    <w:p>
+      <w:pPr>
+        <w:pStyle w:val="Heading2"/>
+      </w:pPr>
+      <w:r>
+        <w:t>Результат для прихода</w:t>
       </w:r>
     </w:p>
     <w:p>
       <w:r>
-        <w:t>Краткая записка сопровождается иллюстрированным каталогом и полным приложением по опубликованным ссылкам. Источник: https://rokmp.de/churches-by-cities/. Срез 15.10.2026. Отсутствие ссылки не означает отсутствия сайта. Мобильный просмотр выполнен для 65 полученных страниц; в 20 случаях ширина документа превышает экран. Подробный разбор четырёх примеров дан в каталоге. Демонстрация: https://prihod.georg-kloster.ru/.</w:t>
+        <w:t>Сотрудник сам ведёт службы, переносы и отмены, обновляет контакты, публикует новости и отвечает на вопросы. Мы фиксируем где нужна помощь и совершенствуем продукт по реальным замечаниям.</w:t>
+      </w:r>
+    </w:p>
+    <w:p>
+      <w:pPr>
+        <w:pStyle w:val="Heading2"/>
+      </w:pPr>
+      <w:r>
+        <w:t>Условия</w:t>
+      </w:r>
+    </w:p>
+    <w:p>
+      <w:r>
+        <w:t>WordPress и техническое обслуживание требуют ответственного. Основной продукт имеет статус release candidate; календарь, записки, пожертвования и внешние сервисы настраиваются отдельно. Тексты прихода не переводятся автоматически.</w:t>
+      </w:r>
+    </w:p>
+    <w:p>
+      <w:pPr>
+        <w:pStyle w:val="Heading2"/>
+      </w:pPr>
+      <w:r>
+        <w:t>Просьба</w:t>
+      </w:r>
+    </w:p>
+    <w:p>
+      <w:r>
+        <w:t>Благословить демонстрацию заинтересованным настоятелям и согласование пилота через контактное лицо. Посещаемость без доступа к аналитике не установлена; отсутствие ссылки в карточке не означает отсутствия сайта.</w:t>
+      </w:r>
+    </w:p>
+    <w:p>
+      <w:pPr>
+        <w:pStyle w:val="Caption"/>
+      </w:pPr>
+      <w:r>
+        <w:t>Срез 15.10.2026 · https://rokmp.de/churches-by-cities/ · Демонстрация https://prihod.georg-kloster.ru/</w:t>
       </w:r>
     </w:p>
     <w:sectPr>
       <w:headerReference w:type="default" r:id="rId9"/>
       <w:footerReference w:type="default" r:id="rId10"/>
-      <w:pgSz w:w="12240" w:h="15840"/>
-      <w:pgMar w:top="1008" w:right="1080" w:bottom="1008" w:left="1080" w:header="720" w:footer="720" w:gutter="0"/>
+      <w:pgSz w:w="15840" w:h="12240" w:orient="landscape"/>
+      <w:pgMar w:top="835" w:right="936" w:bottom="792" w:left="936" w:header="720" w:footer="720" w:gutter="0"/>
       <w:cols w:space="720"/>
       <w:docGrid w:linePitch="360"/>
     </w:sectPr>
@@ -468,7 +160,7 @@
       <w:jc w:val="right"/>
     </w:pPr>
     <w:r>
-      <w:t xml:space="preserve">Приход  •  </w:t>
+      <w:t xml:space="preserve">Приход  ·  </w:t>
     </w:r>
     <w:fldSimple w:instr="PAGE"/>
   </w:p>
@@ -852,10 +544,11 @@
     <w:qFormat/>
     <w:rsid w:val="00FC693F"/>
     <w:pPr>
-      <w:spacing w:after="160" w:line="271" w:lineRule="auto"/>
+      <w:spacing w:after="140" w:line="254" w:lineRule="auto"/>
     </w:pPr>
     <w:rPr>
       <w:rFonts w:ascii="Arial" w:hAnsi="Arial"/>
+      <w:b w:val="0"/>
       <w:color w:val="000000"/>
       <w:sz w:val="22"/>
     </w:rPr>
@@ -915,7 +608,7 @@
     <w:pPr>
       <w:keepNext/>
       <w:keepLines/>
-      <w:spacing w:before="480" w:after="160"/>
+      <w:spacing w:before="480" w:after="140"/>
       <w:outlineLvl w:val="0"/>
     </w:pPr>
     <w:rPr>
@@ -923,7 +616,7 @@
       <w:b/>
       <w:bCs/>
       <w:color w:val="000000"/>
-      <w:sz w:val="38"/>
+      <w:sz w:val="42"/>
       <w:szCs w:val="28"/>
     </w:rPr>
   </w:style>
@@ -939,7 +632,7 @@
     <w:pPr>
       <w:keepNext/>
       <w:keepLines/>
-      <w:spacing w:before="200" w:after="160"/>
+      <w:spacing w:before="200" w:after="140"/>
       <w:outlineLvl w:val="1"/>
     </w:pPr>
     <w:rPr>
@@ -947,7 +640,7 @@
       <w:b/>
       <w:bCs/>
       <w:color w:val="000000"/>
-      <w:sz w:val="26"/>
+      <w:sz w:val="28"/>
       <w:szCs w:val="26"/>
     </w:rPr>
   </w:style>
@@ -1201,15 +894,16 @@
     <w:qFormat/>
     <w:rsid w:val="00FC693F"/>
     <w:pPr>
-      <w:spacing w:after="160" w:line="240" w:lineRule="auto"/>
+      <w:spacing w:after="140" w:line="240" w:lineRule="auto"/>
       <w:contextualSpacing/>
     </w:pPr>
     <w:rPr>
       <w:rFonts w:asciiTheme="majorHAnsi" w:eastAsiaTheme="majorEastAsia" w:hAnsiTheme="majorHAnsi" w:cstheme="majorBidi" w:ascii="Arial" w:hAnsi="Arial"/>
+      <w:b w:val="0"/>
       <w:color w:val="000000"/>
       <w:spacing w:val="5"/>
       <w:kern w:val="28"/>
-      <w:sz w:val="52"/>
+      <w:sz w:val="50"/>
       <w:szCs w:val="52"/>
     </w:rPr>
   </w:style>
@@ -1240,10 +934,11 @@
       <w:numPr>
         <w:ilvl w:val="1"/>
       </w:numPr>
-      <w:spacing w:after="160"/>
+      <w:spacing w:after="140"/>
     </w:pPr>
     <w:rPr>
       <w:rFonts w:asciiTheme="majorHAnsi" w:eastAsiaTheme="majorEastAsia" w:hAnsiTheme="majorHAnsi" w:cstheme="majorBidi" w:ascii="Arial" w:hAnsi="Arial"/>
+      <w:b w:val="0"/>
       <w:i/>
       <w:iCs/>
       <w:color w:val="000000"/>
@@ -1645,11 +1340,11 @@
     <w:qFormat/>
     <w:rsid w:val="00FC693F"/>
     <w:pPr>
-      <w:spacing w:line="240" w:lineRule="auto" w:after="160"/>
+      <w:spacing w:line="240" w:lineRule="auto" w:after="140"/>
     </w:pPr>
     <w:rPr>
       <w:rFonts w:ascii="Arial" w:hAnsi="Arial"/>
-      <w:b/>
+      <w:b w:val="0"/>
       <w:bCs/>
       <w:color w:val="000000"/>
       <w:sz w:val="18"/>

</xml_diff>